<commit_message>
Fix BMVC year 2025->2026 inside Word template
- Update "BMVC 2025 Submission # ??" header text to "BMVC 2026"
- Update document modification date metadata to 2026

Co-Authored-By: Claude Sonnet 4.6 <noreply@anthropic.com>
</commit_message>
<xml_diff>
--- a/BMVC_MS_Office_2026_review.docx
+++ b/BMVC_MS_Office_2026_review.docx
@@ -109,7 +109,7 @@
                                 <w:sz w:val="24"/>
                                 <w:szCs w:val="24"/>
                               </w:rPr>
-                              <w:t>5</w:t>
+                              <w:t>6</w:t>
                             </w:r>
                             <w:r>
                               <w:rPr>
@@ -177,7 +177,7 @@
                           <w:sz w:val="24"/>
                           <w:szCs w:val="24"/>
                         </w:rPr>
-                        <w:t>5</w:t>
+                        <w:t>6</w:t>
                       </w:r>
                       <w:r>
                         <w:rPr>

</xml_diff>